<commit_message>
Add video files for genetic algorithm visualizations and update documentation
</commit_message>
<xml_diff>
--- a/Rapport_Metaheuristiques.docx
+++ b/Rapport_Metaheuristiques.docx
@@ -63,6 +63,9 @@
     <w:p/>
     <w:sdt>
       <w:sdtPr>
+        <w:rPr>
+          <w:rFonts w:ascii="Calibri" w:hAnsi="Calibri"/>
+        </w:rPr>
         <w:id w:val="666453250"/>
         <w:docPartObj>
           <w:docPartGallery w:val="Cover Pages"/>
@@ -71,7 +74,6 @@
       </w:sdtPr>
       <w:sdtEndPr>
         <w:rPr>
-          <w:rFonts w:ascii="Calibri" w:hAnsi="Calibri"/>
           <w:b/>
           <w:bCs/>
           <w:sz w:val="36"/>
@@ -4331,6 +4333,14 @@
     </w:p>
     <w:sdt>
       <w:sdtPr>
+        <w:rPr>
+          <w:rFonts w:ascii="Calibri" w:eastAsiaTheme="minorEastAsia" w:hAnsi="Calibri" w:cstheme="minorBidi"/>
+          <w:b w:val="0"/>
+          <w:bCs w:val="0"/>
+          <w:color w:val="auto"/>
+          <w:sz w:val="22"/>
+          <w:szCs w:val="22"/>
+        </w:rPr>
         <w:id w:val="-1847704318"/>
         <w:docPartObj>
           <w:docPartGallery w:val="Table of Contents"/>
@@ -4339,11 +4349,7 @@
       </w:sdtPr>
       <w:sdtEndPr>
         <w:rPr>
-          <w:rFonts w:ascii="Calibri" w:eastAsiaTheme="minorEastAsia" w:hAnsi="Calibri" w:cstheme="minorBidi"/>
           <w:noProof/>
-          <w:color w:val="auto"/>
-          <w:sz w:val="22"/>
-          <w:szCs w:val="22"/>
         </w:rPr>
       </w:sdtEndPr>
       <w:sdtContent>
@@ -6318,8 +6324,48 @@
         <w:jc w:val="both"/>
       </w:pPr>
       <w:r>
-        <w:t>Ce mini-projet s'inscrit dans le cadre du cours de Techniques d'Optimisation et Recherche Opérationnelle du Master ENSET. Il a pour objectif de concevoir, implémenter et comparer quatre approches métaheuristiques :</w:t>
+        <w:t>Ce mini-</w:t>
       </w:r>
+      <w:proofErr w:type="spellStart"/>
+      <w:r>
+        <w:t>projet</w:t>
+      </w:r>
+      <w:proofErr w:type="spellEnd"/>
+      <w:r>
+        <w:t xml:space="preserve"> </w:t>
+      </w:r>
+      <w:r>
+        <w:t xml:space="preserve">Il a pour </w:t>
+      </w:r>
+      <w:proofErr w:type="spellStart"/>
+      <w:r>
+        <w:t>objectif</w:t>
+      </w:r>
+      <w:proofErr w:type="spellEnd"/>
+      <w:r>
+        <w:t xml:space="preserve"> de </w:t>
+      </w:r>
+      <w:proofErr w:type="spellStart"/>
+      <w:r>
+        <w:t>concevoir</w:t>
+      </w:r>
+      <w:proofErr w:type="spellEnd"/>
+      <w:r>
+        <w:t xml:space="preserve">, </w:t>
+      </w:r>
+      <w:proofErr w:type="spellStart"/>
+      <w:r>
+        <w:t>implémenter</w:t>
+      </w:r>
+      <w:proofErr w:type="spellEnd"/>
+      <w:r>
+        <w:t xml:space="preserve"> et comparer quatre approches </w:t>
+      </w:r>
+      <w:proofErr w:type="gramStart"/>
+      <w:r>
+        <w:t>métaheuristiques :</w:t>
+      </w:r>
+      <w:proofErr w:type="gramEnd"/>
     </w:p>
     <w:p>
       <w:pPr>
@@ -14381,9 +14427,14 @@
       </w:r>
       <w:proofErr w:type="spellEnd"/>
       <w:r>
-        <w:t xml:space="preserve"> des Schèmes</w:t>
+        <w:t xml:space="preserve"> des </w:t>
+      </w:r>
+      <w:proofErr w:type="spellStart"/>
+      <w:r>
+        <w:t>Schèmes</w:t>
       </w:r>
       <w:bookmarkEnd w:id="21"/>
+      <w:proofErr w:type="spellEnd"/>
     </w:p>
     <w:tbl>
       <w:tblPr>

</xml_diff>